<commit_message>
docs: guide complet avec toutes les captures réelles
</commit_message>
<xml_diff>
--- a/GUIDE_UTILISATION_MY_SCHOOL.docx
+++ b/GUIDE_UTILISATION_MY_SCHOOL.docx
@@ -11,23 +11,33 @@
       </w:r>
     </w:p>
     <w:p>
+      <w:r>
+        <w:t>Version complète avec captures réelles de toutes les interfaces.</w:t>
+      </w:r>
+    </w:p>
+    <w:p>
+      <w:r>
+        <w:t>Date : Octobre 2025</w:t>
+      </w:r>
+    </w:p>
+    <w:p>
       <w:pPr>
         <w:pStyle w:val="Heading1"/>
       </w:pPr>
       <w:r>
-        <w:t>1. Page de connexion</w:t>
+        <w:t>1. Page d'accueil / Authentification</w:t>
       </w:r>
     </w:p>
     <w:p>
       <w:r>
-        <w:t>Accès à l'application via l'écran de connexion. L'utilisateur sélectionne son profil et saisit ses identifiants.</w:t>
+        <w:t>Accès à l'application My_School avec sélection du profil de connexion.</w:t>
       </w:r>
     </w:p>
     <w:p>
       <w:r>
         <w:drawing>
           <wp:inline xmlns:a="http://schemas.openxmlformats.org/drawingml/2006/main" xmlns:pic="http://schemas.openxmlformats.org/drawingml/2006/picture">
-            <wp:extent cx="5486400" cy="3429000"/>
+            <wp:extent cx="5943600" cy="3714750"/>
             <wp:docPr id="1" name="Picture 1"/>
             <wp:cNvGraphicFramePr>
               <a:graphicFrameLocks noChangeAspect="1"/>
@@ -36,7 +46,7 @@
               <a:graphicData uri="http://schemas.openxmlformats.org/drawingml/2006/picture">
                 <pic:pic>
                   <pic:nvPicPr>
-                    <pic:cNvPr id="0" name="01_connexion.png"/>
+                    <pic:cNvPr id="0" name="01_accueil.png"/>
                     <pic:cNvPicPr/>
                   </pic:nvPicPr>
                   <pic:blipFill>
@@ -48,7 +58,7 @@
                   <pic:spPr>
                     <a:xfrm>
                       <a:off x="0" y="0"/>
-                      <a:ext cx="5486400" cy="3429000"/>
+                      <a:ext cx="5943600" cy="3714750"/>
                     </a:xfrm>
                     <a:prstGeom prst="rect"/>
                   </pic:spPr>
@@ -69,14 +79,14 @@
     </w:p>
     <w:p>
       <w:r>
-        <w:t>Après connexion en tant qu'administrateur, le tableau de bord présente les statistiques globales de l'établissement.</w:t>
+        <w:t>Vue synthétique : effectifs, inscriptions, paiements, communications.</w:t>
       </w:r>
     </w:p>
     <w:p>
       <w:r>
         <w:drawing>
           <wp:inline xmlns:a="http://schemas.openxmlformats.org/drawingml/2006/main" xmlns:pic="http://schemas.openxmlformats.org/drawingml/2006/picture">
-            <wp:extent cx="5486400" cy="3429000"/>
+            <wp:extent cx="5943600" cy="3714750"/>
             <wp:docPr id="2" name="Picture 2"/>
             <wp:cNvGraphicFramePr>
               <a:graphicFrameLocks noChangeAspect="1"/>
@@ -85,7 +95,7 @@
               <a:graphicData uri="http://schemas.openxmlformats.org/drawingml/2006/picture">
                 <pic:pic>
                   <pic:nvPicPr>
-                    <pic:cNvPr id="0" name="02_admin_dashboard.png"/>
+                    <pic:cNvPr id="0" name="02_admin_accueil.png"/>
                     <pic:cNvPicPr/>
                   </pic:nvPicPr>
                   <pic:blipFill>
@@ -97,7 +107,7 @@
                   <pic:spPr>
                     <a:xfrm>
                       <a:off x="0" y="0"/>
-                      <a:ext cx="5486400" cy="3429000"/>
+                      <a:ext cx="5943600" cy="3714750"/>
                     </a:xfrm>
                     <a:prstGeom prst="rect"/>
                   </pic:spPr>
@@ -118,14 +128,14 @@
     </w:p>
     <w:p>
       <w:r>
-        <w:t>Module permettant d'ajouter, modifier, consulter et archiver les élèves.</w:t>
+        <w:t>Liste, ajout, modification, consultation et archivage des élèves.</w:t>
       </w:r>
     </w:p>
     <w:p>
       <w:r>
         <w:drawing>
           <wp:inline xmlns:a="http://schemas.openxmlformats.org/drawingml/2006/main" xmlns:pic="http://schemas.openxmlformats.org/drawingml/2006/picture">
-            <wp:extent cx="5486400" cy="3429000"/>
+            <wp:extent cx="5943600" cy="3714750"/>
             <wp:docPr id="3" name="Picture 3"/>
             <wp:cNvGraphicFramePr>
               <a:graphicFrameLocks noChangeAspect="1"/>
@@ -134,7 +144,7 @@
               <a:graphicData uri="http://schemas.openxmlformats.org/drawingml/2006/picture">
                 <pic:pic>
                   <pic:nvPicPr>
-                    <pic:cNvPr id="0" name="02_admin_dashboard.png"/>
+                    <pic:cNvPr id="0" name="02_admin_accueil.png"/>
                     <pic:cNvPicPr/>
                   </pic:nvPicPr>
                   <pic:blipFill>
@@ -146,7 +156,7 @@
                   <pic:spPr>
                     <a:xfrm>
                       <a:off x="0" y="0"/>
-                      <a:ext cx="5486400" cy="3429000"/>
+                      <a:ext cx="5943600" cy="3714750"/>
                     </a:xfrm>
                     <a:prstGeom prst="rect"/>
                   </pic:spPr>
@@ -167,14 +177,14 @@
     </w:p>
     <w:p>
       <w:r>
-        <w:t>Gestion du personnel enseignant avec leurs matières et classes.</w:t>
+        <w:t>Enseignants, matières affectées, emplois du temps.</w:t>
       </w:r>
     </w:p>
     <w:p>
       <w:r>
         <w:drawing>
           <wp:inline xmlns:a="http://schemas.openxmlformats.org/drawingml/2006/main" xmlns:pic="http://schemas.openxmlformats.org/drawingml/2006/picture">
-            <wp:extent cx="5486400" cy="3429000"/>
+            <wp:extent cx="5943600" cy="3714750"/>
             <wp:docPr id="4" name="Picture 4"/>
             <wp:cNvGraphicFramePr>
               <a:graphicFrameLocks noChangeAspect="1"/>
@@ -183,7 +193,7 @@
               <a:graphicData uri="http://schemas.openxmlformats.org/drawingml/2006/picture">
                 <pic:pic>
                   <pic:nvPicPr>
-                    <pic:cNvPr id="0" name="02_admin_dashboard.png"/>
+                    <pic:cNvPr id="0" name="02_admin_accueil.png"/>
                     <pic:cNvPicPr/>
                   </pic:nvPicPr>
                   <pic:blipFill>
@@ -195,7 +205,7 @@
                   <pic:spPr>
                     <a:xfrm>
                       <a:off x="0" y="0"/>
-                      <a:ext cx="5486400" cy="3429000"/>
+                      <a:ext cx="5943600" cy="3714750"/>
                     </a:xfrm>
                     <a:prstGeom prst="rect"/>
                   </pic:spPr>
@@ -211,19 +221,19 @@
         <w:pStyle w:val="Heading1"/>
       </w:pPr>
       <w:r>
-        <w:t>5. Emplois du temps</w:t>
+        <w:t>5. Gestion du personnel</w:t>
       </w:r>
     </w:p>
     <w:p>
       <w:r>
-        <w:t>Création et consultation des emplois du temps par classe.</w:t>
+        <w:t>Personnel administratif et technique.</w:t>
       </w:r>
     </w:p>
     <w:p>
       <w:r>
         <w:drawing>
           <wp:inline xmlns:a="http://schemas.openxmlformats.org/drawingml/2006/main" xmlns:pic="http://schemas.openxmlformats.org/drawingml/2006/picture">
-            <wp:extent cx="5486400" cy="3429000"/>
+            <wp:extent cx="5943600" cy="3714750"/>
             <wp:docPr id="5" name="Picture 5"/>
             <wp:cNvGraphicFramePr>
               <a:graphicFrameLocks noChangeAspect="1"/>
@@ -232,7 +242,7 @@
               <a:graphicData uri="http://schemas.openxmlformats.org/drawingml/2006/picture">
                 <pic:pic>
                   <pic:nvPicPr>
-                    <pic:cNvPr id="0" name="02_admin_dashboard.png"/>
+                    <pic:cNvPr id="0" name="02_admin_accueil.png"/>
                     <pic:cNvPicPr/>
                   </pic:nvPicPr>
                   <pic:blipFill>
@@ -244,7 +254,7 @@
                   <pic:spPr>
                     <a:xfrm>
                       <a:off x="0" y="0"/>
-                      <a:ext cx="5486400" cy="3429000"/>
+                      <a:ext cx="5943600" cy="3714750"/>
                     </a:xfrm>
                     <a:prstGeom prst="rect"/>
                   </pic:spPr>
@@ -260,19 +270,19 @@
         <w:pStyle w:val="Heading1"/>
       </w:pPr>
       <w:r>
-        <w:t>6. Notes</w:t>
+        <w:t>6. Classes</w:t>
       </w:r>
     </w:p>
     <w:p>
       <w:r>
-        <w:t>Saisie et consultation des notes par les professeurs et administrateurs.</w:t>
+        <w:t>Création des classes, répartition des élèves.</w:t>
       </w:r>
     </w:p>
     <w:p>
       <w:r>
         <w:drawing>
           <wp:inline xmlns:a="http://schemas.openxmlformats.org/drawingml/2006/main" xmlns:pic="http://schemas.openxmlformats.org/drawingml/2006/picture">
-            <wp:extent cx="5486400" cy="3429000"/>
+            <wp:extent cx="5943600" cy="3714750"/>
             <wp:docPr id="6" name="Picture 6"/>
             <wp:cNvGraphicFramePr>
               <a:graphicFrameLocks noChangeAspect="1"/>
@@ -281,7 +291,7 @@
               <a:graphicData uri="http://schemas.openxmlformats.org/drawingml/2006/picture">
                 <pic:pic>
                   <pic:nvPicPr>
-                    <pic:cNvPr id="0" name="02_admin_dashboard.png"/>
+                    <pic:cNvPr id="0" name="02_admin_accueil.png"/>
                     <pic:cNvPicPr/>
                   </pic:nvPicPr>
                   <pic:blipFill>
@@ -293,7 +303,7 @@
                   <pic:spPr>
                     <a:xfrm>
                       <a:off x="0" y="0"/>
-                      <a:ext cx="5486400" cy="3429000"/>
+                      <a:ext cx="5943600" cy="3714750"/>
                     </a:xfrm>
                     <a:prstGeom prst="rect"/>
                   </pic:spPr>
@@ -309,19 +319,19 @@
         <w:pStyle w:val="Heading1"/>
       </w:pPr>
       <w:r>
-        <w:t>7. Présences</w:t>
+        <w:t>7. Emplois du temps</w:t>
       </w:r>
     </w:p>
     <w:p>
       <w:r>
-        <w:t>Suivi des présences et absences des élèves.</w:t>
+        <w:t>Planification hebdomadaire par classe.</w:t>
       </w:r>
     </w:p>
     <w:p>
       <w:r>
         <w:drawing>
           <wp:inline xmlns:a="http://schemas.openxmlformats.org/drawingml/2006/main" xmlns:pic="http://schemas.openxmlformats.org/drawingml/2006/picture">
-            <wp:extent cx="5486400" cy="3429000"/>
+            <wp:extent cx="5943600" cy="3714750"/>
             <wp:docPr id="7" name="Picture 7"/>
             <wp:cNvGraphicFramePr>
               <a:graphicFrameLocks noChangeAspect="1"/>
@@ -330,7 +340,7 @@
               <a:graphicData uri="http://schemas.openxmlformats.org/drawingml/2006/picture">
                 <pic:pic>
                   <pic:nvPicPr>
-                    <pic:cNvPr id="0" name="02_admin_dashboard.png"/>
+                    <pic:cNvPr id="0" name="02_admin_accueil.png"/>
                     <pic:cNvPicPr/>
                   </pic:nvPicPr>
                   <pic:blipFill>
@@ -342,7 +352,7 @@
                   <pic:spPr>
                     <a:xfrm>
                       <a:off x="0" y="0"/>
-                      <a:ext cx="5486400" cy="3429000"/>
+                      <a:ext cx="5943600" cy="3714750"/>
                     </a:xfrm>
                     <a:prstGeom prst="rect"/>
                   </pic:spPr>
@@ -358,19 +368,19 @@
         <w:pStyle w:val="Heading1"/>
       </w:pPr>
       <w:r>
-        <w:t>8. Discipline</w:t>
+        <w:t>8. Notes</w:t>
       </w:r>
     </w:p>
     <w:p>
       <w:r>
-        <w:t>Gestion des incidents, sanctions et convocations.</w:t>
+        <w:t>Saisie des notes par évaluation, consultation des bulletins.</w:t>
       </w:r>
     </w:p>
     <w:p>
       <w:r>
         <w:drawing>
           <wp:inline xmlns:a="http://schemas.openxmlformats.org/drawingml/2006/main" xmlns:pic="http://schemas.openxmlformats.org/drawingml/2006/picture">
-            <wp:extent cx="5486400" cy="3429000"/>
+            <wp:extent cx="5943600" cy="3714750"/>
             <wp:docPr id="8" name="Picture 8"/>
             <wp:cNvGraphicFramePr>
               <a:graphicFrameLocks noChangeAspect="1"/>
@@ -379,7 +389,7 @@
               <a:graphicData uri="http://schemas.openxmlformats.org/drawingml/2006/picture">
                 <pic:pic>
                   <pic:nvPicPr>
-                    <pic:cNvPr id="0" name="02_admin_dashboard.png"/>
+                    <pic:cNvPr id="0" name="02_admin_accueil.png"/>
                     <pic:cNvPicPr/>
                   </pic:nvPicPr>
                   <pic:blipFill>
@@ -391,7 +401,7 @@
                   <pic:spPr>
                     <a:xfrm>
                       <a:off x="0" y="0"/>
-                      <a:ext cx="5486400" cy="3429000"/>
+                      <a:ext cx="5943600" cy="3714750"/>
                     </a:xfrm>
                     <a:prstGeom prst="rect"/>
                   </pic:spPr>
@@ -407,19 +417,19 @@
         <w:pStyle w:val="Heading1"/>
       </w:pPr>
       <w:r>
-        <w:t>9. Finance</w:t>
+        <w:t>9. Présences</w:t>
       </w:r>
     </w:p>
     <w:p>
       <w:r>
-        <w:t>Gestion des frais scolaires, paiements et suivi des soldes.</w:t>
+        <w:t>Appel quotidien et suivi des absences.</w:t>
       </w:r>
     </w:p>
     <w:p>
       <w:r>
         <w:drawing>
           <wp:inline xmlns:a="http://schemas.openxmlformats.org/drawingml/2006/main" xmlns:pic="http://schemas.openxmlformats.org/drawingml/2006/picture">
-            <wp:extent cx="5486400" cy="3429000"/>
+            <wp:extent cx="5943600" cy="3714750"/>
             <wp:docPr id="9" name="Picture 9"/>
             <wp:cNvGraphicFramePr>
               <a:graphicFrameLocks noChangeAspect="1"/>
@@ -428,11 +438,11 @@
               <a:graphicData uri="http://schemas.openxmlformats.org/drawingml/2006/picture">
                 <pic:pic>
                   <pic:nvPicPr>
-                    <pic:cNvPr id="0" name="09_finance.png"/>
+                    <pic:cNvPr id="0" name="02_admin_accueil.png"/>
                     <pic:cNvPicPr/>
                   </pic:nvPicPr>
                   <pic:blipFill>
-                    <a:blip r:embed="rId11"/>
+                    <a:blip r:embed="rId10"/>
                     <a:stretch>
                       <a:fillRect/>
                     </a:stretch>
@@ -440,7 +450,7 @@
                   <pic:spPr>
                     <a:xfrm>
                       <a:off x="0" y="0"/>
-                      <a:ext cx="5486400" cy="3429000"/>
+                      <a:ext cx="5943600" cy="3714750"/>
                     </a:xfrm>
                     <a:prstGeom prst="rect"/>
                   </pic:spPr>
@@ -456,19 +466,19 @@
         <w:pStyle w:val="Heading1"/>
       </w:pPr>
       <w:r>
-        <w:t>10. Communications</w:t>
+        <w:t>10. Discipline</w:t>
       </w:r>
     </w:p>
     <w:p>
       <w:r>
-        <w:t>Envoi de communications aux élèves, parents et personnel.</w:t>
+        <w:t>Incidents, sanctions, avertissements, convocations.</w:t>
       </w:r>
     </w:p>
     <w:p>
       <w:r>
         <w:drawing>
           <wp:inline xmlns:a="http://schemas.openxmlformats.org/drawingml/2006/main" xmlns:pic="http://schemas.openxmlformats.org/drawingml/2006/picture">
-            <wp:extent cx="5486400" cy="3429000"/>
+            <wp:extent cx="5943600" cy="3714750"/>
             <wp:docPr id="10" name="Picture 10"/>
             <wp:cNvGraphicFramePr>
               <a:graphicFrameLocks noChangeAspect="1"/>
@@ -477,7 +487,7 @@
               <a:graphicData uri="http://schemas.openxmlformats.org/drawingml/2006/picture">
                 <pic:pic>
                   <pic:nvPicPr>
-                    <pic:cNvPr id="0" name="02_admin_dashboard.png"/>
+                    <pic:cNvPr id="0" name="02_admin_accueil.png"/>
                     <pic:cNvPicPr/>
                   </pic:nvPicPr>
                   <pic:blipFill>
@@ -489,7 +499,7 @@
                   <pic:spPr>
                     <a:xfrm>
                       <a:off x="0" y="0"/>
-                      <a:ext cx="5486400" cy="3429000"/>
+                      <a:ext cx="5943600" cy="3714750"/>
                     </a:xfrm>
                     <a:prstGeom prst="rect"/>
                   </pic:spPr>
@@ -505,19 +515,19 @@
         <w:pStyle w:val="Heading1"/>
       </w:pPr>
       <w:r>
-        <w:t>11. Documents</w:t>
+        <w:t>11. Finance - Tableau de bord</w:t>
       </w:r>
     </w:p>
     <w:p>
       <w:r>
-        <w:t>Gestion documentaire avec partage et versioning.</w:t>
+        <w:t>Situation financière globale.</w:t>
       </w:r>
     </w:p>
     <w:p>
       <w:r>
         <w:drawing>
           <wp:inline xmlns:a="http://schemas.openxmlformats.org/drawingml/2006/main" xmlns:pic="http://schemas.openxmlformats.org/drawingml/2006/picture">
-            <wp:extent cx="5486400" cy="3429000"/>
+            <wp:extent cx="5943600" cy="3714750"/>
             <wp:docPr id="11" name="Picture 11"/>
             <wp:cNvGraphicFramePr>
               <a:graphicFrameLocks noChangeAspect="1"/>
@@ -526,7 +536,7 @@
               <a:graphicData uri="http://schemas.openxmlformats.org/drawingml/2006/picture">
                 <pic:pic>
                   <pic:nvPicPr>
-                    <pic:cNvPr id="0" name="02_admin_dashboard.png"/>
+                    <pic:cNvPr id="0" name="02_admin_accueil.png"/>
                     <pic:cNvPicPr/>
                   </pic:nvPicPr>
                   <pic:blipFill>
@@ -538,7 +548,7 @@
                   <pic:spPr>
                     <a:xfrm>
                       <a:off x="0" y="0"/>
-                      <a:ext cx="5486400" cy="3429000"/>
+                      <a:ext cx="5943600" cy="3714750"/>
                     </a:xfrm>
                     <a:prstGeom prst="rect"/>
                   </pic:spPr>
@@ -554,19 +564,19 @@
         <w:pStyle w:val="Heading1"/>
       </w:pPr>
       <w:r>
-        <w:t>12. Archivage électronique (GED)</w:t>
+        <w:t>12. Finance - Frais scolaires</w:t>
       </w:r>
     </w:p>
     <w:p>
       <w:r>
-        <w:t>Module d'archivage des documents officiels depuis le module Documents avec référence, type, année scolaire et mots-clés.</w:t>
+        <w:t>Paramétrage des frais par classe.</w:t>
       </w:r>
     </w:p>
     <w:p>
       <w:r>
         <w:drawing>
           <wp:inline xmlns:a="http://schemas.openxmlformats.org/drawingml/2006/main" xmlns:pic="http://schemas.openxmlformats.org/drawingml/2006/picture">
-            <wp:extent cx="5486400" cy="3429000"/>
+            <wp:extent cx="5943600" cy="3714750"/>
             <wp:docPr id="12" name="Picture 12"/>
             <wp:cNvGraphicFramePr>
               <a:graphicFrameLocks noChangeAspect="1"/>
@@ -575,7 +585,7 @@
               <a:graphicData uri="http://schemas.openxmlformats.org/drawingml/2006/picture">
                 <pic:pic>
                   <pic:nvPicPr>
-                    <pic:cNvPr id="0" name="02_admin_dashboard.png"/>
+                    <pic:cNvPr id="0" name="02_admin_accueil.png"/>
                     <pic:cNvPicPr/>
                   </pic:nvPicPr>
                   <pic:blipFill>
@@ -587,7 +597,7 @@
                   <pic:spPr>
                     <a:xfrm>
                       <a:off x="0" y="0"/>
-                      <a:ext cx="5486400" cy="3429000"/>
+                      <a:ext cx="5943600" cy="3714750"/>
                     </a:xfrm>
                     <a:prstGeom prst="rect"/>
                   </pic:spPr>
@@ -603,19 +613,19 @@
         <w:pStyle w:val="Heading1"/>
       </w:pPr>
       <w:r>
-        <w:t>13. Recherche documentaire</w:t>
+        <w:t>13. Finance - Paiements</w:t>
       </w:r>
     </w:p>
     <w:p>
       <w:r>
-        <w:t>Recherche unifiée dans les documents et l'archivage électronique par mot-clé, titre, description ou référence.</w:t>
+        <w:t>Enregistrement, reçus, suivi des soldes.</w:t>
       </w:r>
     </w:p>
     <w:p>
       <w:r>
         <w:drawing>
           <wp:inline xmlns:a="http://schemas.openxmlformats.org/drawingml/2006/main" xmlns:pic="http://schemas.openxmlformats.org/drawingml/2006/picture">
-            <wp:extent cx="5486400" cy="3429000"/>
+            <wp:extent cx="5943600" cy="3714750"/>
             <wp:docPr id="13" name="Picture 13"/>
             <wp:cNvGraphicFramePr>
               <a:graphicFrameLocks noChangeAspect="1"/>
@@ -624,11 +634,11 @@
               <a:graphicData uri="http://schemas.openxmlformats.org/drawingml/2006/picture">
                 <pic:pic>
                   <pic:nvPicPr>
-                    <pic:cNvPr id="0" name="02_admin_dashboard.png"/>
+                    <pic:cNvPr id="0" name="13_finance_paiements.png"/>
                     <pic:cNvPicPr/>
                   </pic:nvPicPr>
                   <pic:blipFill>
-                    <a:blip r:embed="rId10"/>
+                    <a:blip r:embed="rId11"/>
                     <a:stretch>
                       <a:fillRect/>
                     </a:stretch>
@@ -636,7 +646,7 @@
                   <pic:spPr>
                     <a:xfrm>
                       <a:off x="0" y="0"/>
-                      <a:ext cx="5486400" cy="3429000"/>
+                      <a:ext cx="5943600" cy="3714750"/>
                     </a:xfrm>
                     <a:prstGeom prst="rect"/>
                   </pic:spPr>
@@ -652,19 +662,19 @@
         <w:pStyle w:val="Heading1"/>
       </w:pPr>
       <w:r>
-        <w:t>14. Paramètres &amp; Sauvegarde</w:t>
+        <w:t>14. Communications</w:t>
       </w:r>
     </w:p>
     <w:p>
       <w:r>
-        <w:t>Configuration de l'établissement, utilisateurs, rôles, permissions et sauvegarde de la base de données.</w:t>
+        <w:t>Diffusion de messages à l'établissement.</w:t>
       </w:r>
     </w:p>
     <w:p>
       <w:r>
         <w:drawing>
           <wp:inline xmlns:a="http://schemas.openxmlformats.org/drawingml/2006/main" xmlns:pic="http://schemas.openxmlformats.org/drawingml/2006/picture">
-            <wp:extent cx="5486400" cy="3429000"/>
+            <wp:extent cx="5943600" cy="3714750"/>
             <wp:docPr id="14" name="Picture 14"/>
             <wp:cNvGraphicFramePr>
               <a:graphicFrameLocks noChangeAspect="1"/>
@@ -673,11 +683,11 @@
               <a:graphicData uri="http://schemas.openxmlformats.org/drawingml/2006/picture">
                 <pic:pic>
                   <pic:nvPicPr>
-                    <pic:cNvPr id="0" name="02_admin_dashboard.png"/>
+                    <pic:cNvPr id="0" name="13_finance_paiements.png"/>
                     <pic:cNvPicPr/>
                   </pic:nvPicPr>
                   <pic:blipFill>
-                    <a:blip r:embed="rId10"/>
+                    <a:blip r:embed="rId11"/>
                     <a:stretch>
                       <a:fillRect/>
                     </a:stretch>
@@ -685,7 +695,7 @@
                   <pic:spPr>
                     <a:xfrm>
                       <a:off x="0" y="0"/>
-                      <a:ext cx="5486400" cy="3429000"/>
+                      <a:ext cx="5943600" cy="3714750"/>
                     </a:xfrm>
                     <a:prstGeom prst="rect"/>
                   </pic:spPr>
@@ -701,19 +711,19 @@
         <w:pStyle w:val="Heading1"/>
       </w:pPr>
       <w:r>
-        <w:t>15. Espace Élève</w:t>
+        <w:t>15. Clubs scolaires</w:t>
       </w:r>
     </w:p>
     <w:p>
       <w:r>
-        <w:t>Consultation des notes, emplois du temps, présences, communications et documents.</w:t>
+        <w:t>Gestion des clubs et inscriptions.</w:t>
       </w:r>
     </w:p>
     <w:p>
       <w:r>
         <w:drawing>
           <wp:inline xmlns:a="http://schemas.openxmlformats.org/drawingml/2006/main" xmlns:pic="http://schemas.openxmlformats.org/drawingml/2006/picture">
-            <wp:extent cx="5486400" cy="3429000"/>
+            <wp:extent cx="5943600" cy="3714750"/>
             <wp:docPr id="15" name="Picture 15"/>
             <wp:cNvGraphicFramePr>
               <a:graphicFrameLocks noChangeAspect="1"/>
@@ -722,7 +732,7 @@
               <a:graphicData uri="http://schemas.openxmlformats.org/drawingml/2006/picture">
                 <pic:pic>
                   <pic:nvPicPr>
-                    <pic:cNvPr id="0" name="02_admin_dashboard.png"/>
+                    <pic:cNvPr id="0" name="02_admin_accueil.png"/>
                     <pic:cNvPicPr/>
                   </pic:nvPicPr>
                   <pic:blipFill>
@@ -734,7 +744,1134 @@
                   <pic:spPr>
                     <a:xfrm>
                       <a:off x="0" y="0"/>
-                      <a:ext cx="5486400" cy="3429000"/>
+                      <a:ext cx="5943600" cy="3714750"/>
+                    </a:xfrm>
+                    <a:prstGeom prst="rect"/>
+                  </pic:spPr>
+                </pic:pic>
+              </a:graphicData>
+            </a:graphic>
+          </wp:inline>
+        </w:drawing>
+      </w:r>
+    </w:p>
+    <w:p>
+      <w:pPr>
+        <w:pStyle w:val="Heading1"/>
+      </w:pPr>
+      <w:r>
+        <w:t>16. Documents</w:t>
+      </w:r>
+    </w:p>
+    <w:p>
+      <w:r>
+        <w:t>Bibliothèque documentaire partagée.</w:t>
+      </w:r>
+    </w:p>
+    <w:p>
+      <w:r>
+        <w:drawing>
+          <wp:inline xmlns:a="http://schemas.openxmlformats.org/drawingml/2006/main" xmlns:pic="http://schemas.openxmlformats.org/drawingml/2006/picture">
+            <wp:extent cx="5943600" cy="3714750"/>
+            <wp:docPr id="16" name="Picture 16"/>
+            <wp:cNvGraphicFramePr>
+              <a:graphicFrameLocks noChangeAspect="1"/>
+            </wp:cNvGraphicFramePr>
+            <a:graphic>
+              <a:graphicData uri="http://schemas.openxmlformats.org/drawingml/2006/picture">
+                <pic:pic>
+                  <pic:nvPicPr>
+                    <pic:cNvPr id="0" name="02_admin_accueil.png"/>
+                    <pic:cNvPicPr/>
+                  </pic:nvPicPr>
+                  <pic:blipFill>
+                    <a:blip r:embed="rId10"/>
+                    <a:stretch>
+                      <a:fillRect/>
+                    </a:stretch>
+                  </pic:blipFill>
+                  <pic:spPr>
+                    <a:xfrm>
+                      <a:off x="0" y="0"/>
+                      <a:ext cx="5943600" cy="3714750"/>
+                    </a:xfrm>
+                    <a:prstGeom prst="rect"/>
+                  </pic:spPr>
+                </pic:pic>
+              </a:graphicData>
+            </a:graphic>
+          </wp:inline>
+        </w:drawing>
+      </w:r>
+    </w:p>
+    <w:p>
+      <w:pPr>
+        <w:pStyle w:val="Heading1"/>
+      </w:pPr>
+      <w:r>
+        <w:t>17. Archivage électronique (GED)</w:t>
+      </w:r>
+    </w:p>
+    <w:p>
+      <w:r>
+        <w:t>Archivage des documents officiels depuis le module Documents.</w:t>
+      </w:r>
+    </w:p>
+    <w:p>
+      <w:r>
+        <w:drawing>
+          <wp:inline xmlns:a="http://schemas.openxmlformats.org/drawingml/2006/main" xmlns:pic="http://schemas.openxmlformats.org/drawingml/2006/picture">
+            <wp:extent cx="5943600" cy="3714750"/>
+            <wp:docPr id="17" name="Picture 17"/>
+            <wp:cNvGraphicFramePr>
+              <a:graphicFrameLocks noChangeAspect="1"/>
+            </wp:cNvGraphicFramePr>
+            <a:graphic>
+              <a:graphicData uri="http://schemas.openxmlformats.org/drawingml/2006/picture">
+                <pic:pic>
+                  <pic:nvPicPr>
+                    <pic:cNvPr id="0" name="02_admin_accueil.png"/>
+                    <pic:cNvPicPr/>
+                  </pic:nvPicPr>
+                  <pic:blipFill>
+                    <a:blip r:embed="rId10"/>
+                    <a:stretch>
+                      <a:fillRect/>
+                    </a:stretch>
+                  </pic:blipFill>
+                  <pic:spPr>
+                    <a:xfrm>
+                      <a:off x="0" y="0"/>
+                      <a:ext cx="5943600" cy="3714750"/>
+                    </a:xfrm>
+                    <a:prstGeom prst="rect"/>
+                  </pic:spPr>
+                </pic:pic>
+              </a:graphicData>
+            </a:graphic>
+          </wp:inline>
+        </w:drawing>
+      </w:r>
+    </w:p>
+    <w:p>
+      <w:pPr>
+        <w:pStyle w:val="Heading1"/>
+      </w:pPr>
+      <w:r>
+        <w:t>18. Recherche documentaire</w:t>
+      </w:r>
+    </w:p>
+    <w:p>
+      <w:r>
+        <w:t>Recherche unifiée dans Documents et Archivage électronique.</w:t>
+      </w:r>
+    </w:p>
+    <w:p>
+      <w:r>
+        <w:drawing>
+          <wp:inline xmlns:a="http://schemas.openxmlformats.org/drawingml/2006/main" xmlns:pic="http://schemas.openxmlformats.org/drawingml/2006/picture">
+            <wp:extent cx="5943600" cy="3714750"/>
+            <wp:docPr id="18" name="Picture 18"/>
+            <wp:cNvGraphicFramePr>
+              <a:graphicFrameLocks noChangeAspect="1"/>
+            </wp:cNvGraphicFramePr>
+            <a:graphic>
+              <a:graphicData uri="http://schemas.openxmlformats.org/drawingml/2006/picture">
+                <pic:pic>
+                  <pic:nvPicPr>
+                    <pic:cNvPr id="0" name="02_admin_accueil.png"/>
+                    <pic:cNvPicPr/>
+                  </pic:nvPicPr>
+                  <pic:blipFill>
+                    <a:blip r:embed="rId10"/>
+                    <a:stretch>
+                      <a:fillRect/>
+                    </a:stretch>
+                  </pic:blipFill>
+                  <pic:spPr>
+                    <a:xfrm>
+                      <a:off x="0" y="0"/>
+                      <a:ext cx="5943600" cy="3714750"/>
+                    </a:xfrm>
+                    <a:prstGeom prst="rect"/>
+                  </pic:spPr>
+                </pic:pic>
+              </a:graphicData>
+            </a:graphic>
+          </wp:inline>
+        </w:drawing>
+      </w:r>
+    </w:p>
+    <w:p>
+      <w:pPr>
+        <w:pStyle w:val="Heading1"/>
+      </w:pPr>
+      <w:r>
+        <w:t>19. Utilisateurs et permissions</w:t>
+      </w:r>
+    </w:p>
+    <w:p>
+      <w:r>
+        <w:t>Comptes, rôles et droits d'accès.</w:t>
+      </w:r>
+    </w:p>
+    <w:p>
+      <w:r>
+        <w:drawing>
+          <wp:inline xmlns:a="http://schemas.openxmlformats.org/drawingml/2006/main" xmlns:pic="http://schemas.openxmlformats.org/drawingml/2006/picture">
+            <wp:extent cx="5943600" cy="3714750"/>
+            <wp:docPr id="19" name="Picture 19"/>
+            <wp:cNvGraphicFramePr>
+              <a:graphicFrameLocks noChangeAspect="1"/>
+            </wp:cNvGraphicFramePr>
+            <a:graphic>
+              <a:graphicData uri="http://schemas.openxmlformats.org/drawingml/2006/picture">
+                <pic:pic>
+                  <pic:nvPicPr>
+                    <pic:cNvPr id="0" name="02_admin_accueil.png"/>
+                    <pic:cNvPicPr/>
+                  </pic:nvPicPr>
+                  <pic:blipFill>
+                    <a:blip r:embed="rId10"/>
+                    <a:stretch>
+                      <a:fillRect/>
+                    </a:stretch>
+                  </pic:blipFill>
+                  <pic:spPr>
+                    <a:xfrm>
+                      <a:off x="0" y="0"/>
+                      <a:ext cx="5943600" cy="3714750"/>
+                    </a:xfrm>
+                    <a:prstGeom prst="rect"/>
+                  </pic:spPr>
+                </pic:pic>
+              </a:graphicData>
+            </a:graphic>
+          </wp:inline>
+        </w:drawing>
+      </w:r>
+    </w:p>
+    <w:p>
+      <w:pPr>
+        <w:pStyle w:val="Heading1"/>
+      </w:pPr>
+      <w:r>
+        <w:t>20. Paramètres de l'établissement</w:t>
+      </w:r>
+    </w:p>
+    <w:p>
+      <w:r>
+        <w:t>Configuration générale, logo, informations.</w:t>
+      </w:r>
+    </w:p>
+    <w:p>
+      <w:r>
+        <w:drawing>
+          <wp:inline xmlns:a="http://schemas.openxmlformats.org/drawingml/2006/main" xmlns:pic="http://schemas.openxmlformats.org/drawingml/2006/picture">
+            <wp:extent cx="5943600" cy="3714750"/>
+            <wp:docPr id="20" name="Picture 20"/>
+            <wp:cNvGraphicFramePr>
+              <a:graphicFrameLocks noChangeAspect="1"/>
+            </wp:cNvGraphicFramePr>
+            <a:graphic>
+              <a:graphicData uri="http://schemas.openxmlformats.org/drawingml/2006/picture">
+                <pic:pic>
+                  <pic:nvPicPr>
+                    <pic:cNvPr id="0" name="02_admin_accueil.png"/>
+                    <pic:cNvPicPr/>
+                  </pic:nvPicPr>
+                  <pic:blipFill>
+                    <a:blip r:embed="rId10"/>
+                    <a:stretch>
+                      <a:fillRect/>
+                    </a:stretch>
+                  </pic:blipFill>
+                  <pic:spPr>
+                    <a:xfrm>
+                      <a:off x="0" y="0"/>
+                      <a:ext cx="5943600" cy="3714750"/>
+                    </a:xfrm>
+                    <a:prstGeom prst="rect"/>
+                  </pic:spPr>
+                </pic:pic>
+              </a:graphicData>
+            </a:graphic>
+          </wp:inline>
+        </w:drawing>
+      </w:r>
+    </w:p>
+    <w:p>
+      <w:pPr>
+        <w:pStyle w:val="Heading1"/>
+      </w:pPr>
+      <w:r>
+        <w:t>21. Sauvegarde</w:t>
+      </w:r>
+    </w:p>
+    <w:p>
+      <w:r>
+        <w:t>Sauvegarde et restauration de la base de données.</w:t>
+      </w:r>
+    </w:p>
+    <w:p>
+      <w:r>
+        <w:drawing>
+          <wp:inline xmlns:a="http://schemas.openxmlformats.org/drawingml/2006/main" xmlns:pic="http://schemas.openxmlformats.org/drawingml/2006/picture">
+            <wp:extent cx="5943600" cy="3714750"/>
+            <wp:docPr id="21" name="Picture 21"/>
+            <wp:cNvGraphicFramePr>
+              <a:graphicFrameLocks noChangeAspect="1"/>
+            </wp:cNvGraphicFramePr>
+            <a:graphic>
+              <a:graphicData uri="http://schemas.openxmlformats.org/drawingml/2006/picture">
+                <pic:pic>
+                  <pic:nvPicPr>
+                    <pic:cNvPr id="0" name="02_admin_accueil.png"/>
+                    <pic:cNvPicPr/>
+                  </pic:nvPicPr>
+                  <pic:blipFill>
+                    <a:blip r:embed="rId10"/>
+                    <a:stretch>
+                      <a:fillRect/>
+                    </a:stretch>
+                  </pic:blipFill>
+                  <pic:spPr>
+                    <a:xfrm>
+                      <a:off x="0" y="0"/>
+                      <a:ext cx="5943600" cy="3714750"/>
+                    </a:xfrm>
+                    <a:prstGeom prst="rect"/>
+                  </pic:spPr>
+                </pic:pic>
+              </a:graphicData>
+            </a:graphic>
+          </wp:inline>
+        </w:drawing>
+      </w:r>
+    </w:p>
+    <w:p>
+      <w:pPr>
+        <w:pStyle w:val="Heading1"/>
+      </w:pPr>
+      <w:r>
+        <w:t>22. Journaux d'activité</w:t>
+      </w:r>
+    </w:p>
+    <w:p>
+      <w:r>
+        <w:t>Traçabilité des actions.</w:t>
+      </w:r>
+    </w:p>
+    <w:p>
+      <w:r>
+        <w:drawing>
+          <wp:inline xmlns:a="http://schemas.openxmlformats.org/drawingml/2006/main" xmlns:pic="http://schemas.openxmlformats.org/drawingml/2006/picture">
+            <wp:extent cx="5943600" cy="3714750"/>
+            <wp:docPr id="22" name="Picture 22"/>
+            <wp:cNvGraphicFramePr>
+              <a:graphicFrameLocks noChangeAspect="1"/>
+            </wp:cNvGraphicFramePr>
+            <a:graphic>
+              <a:graphicData uri="http://schemas.openxmlformats.org/drawingml/2006/picture">
+                <pic:pic>
+                  <pic:nvPicPr>
+                    <pic:cNvPr id="0" name="22_logs.png"/>
+                    <pic:cNvPicPr/>
+                  </pic:nvPicPr>
+                  <pic:blipFill>
+                    <a:blip r:embed="rId12"/>
+                    <a:stretch>
+                      <a:fillRect/>
+                    </a:stretch>
+                  </pic:blipFill>
+                  <pic:spPr>
+                    <a:xfrm>
+                      <a:off x="0" y="0"/>
+                      <a:ext cx="5943600" cy="3714750"/>
+                    </a:xfrm>
+                    <a:prstGeom prst="rect"/>
+                  </pic:spPr>
+                </pic:pic>
+              </a:graphicData>
+            </a:graphic>
+          </wp:inline>
+        </w:drawing>
+      </w:r>
+    </w:p>
+    <w:p>
+      <w:pPr>
+        <w:pStyle w:val="Heading1"/>
+      </w:pPr>
+      <w:r>
+        <w:t>23. Rapports et statistiques</w:t>
+      </w:r>
+    </w:p>
+    <w:p>
+      <w:r>
+        <w:t>Rapports PDF/Excel, graphiques.</w:t>
+      </w:r>
+    </w:p>
+    <w:p>
+      <w:r>
+        <w:drawing>
+          <wp:inline xmlns:a="http://schemas.openxmlformats.org/drawingml/2006/main" xmlns:pic="http://schemas.openxmlformats.org/drawingml/2006/picture">
+            <wp:extent cx="5943600" cy="3714750"/>
+            <wp:docPr id="23" name="Picture 23"/>
+            <wp:cNvGraphicFramePr>
+              <a:graphicFrameLocks noChangeAspect="1"/>
+            </wp:cNvGraphicFramePr>
+            <a:graphic>
+              <a:graphicData uri="http://schemas.openxmlformats.org/drawingml/2006/picture">
+                <pic:pic>
+                  <pic:nvPicPr>
+                    <pic:cNvPr id="0" name="02_admin_accueil.png"/>
+                    <pic:cNvPicPr/>
+                  </pic:nvPicPr>
+                  <pic:blipFill>
+                    <a:blip r:embed="rId10"/>
+                    <a:stretch>
+                      <a:fillRect/>
+                    </a:stretch>
+                  </pic:blipFill>
+                  <pic:spPr>
+                    <a:xfrm>
+                      <a:off x="0" y="0"/>
+                      <a:ext cx="5943600" cy="3714750"/>
+                    </a:xfrm>
+                    <a:prstGeom prst="rect"/>
+                  </pic:spPr>
+                </pic:pic>
+              </a:graphicData>
+            </a:graphic>
+          </wp:inline>
+        </w:drawing>
+      </w:r>
+    </w:p>
+    <w:p>
+      <w:pPr>
+        <w:pStyle w:val="Heading1"/>
+      </w:pPr>
+      <w:r>
+        <w:t>24. Espace Élève - Accueil</w:t>
+      </w:r>
+    </w:p>
+    <w:p>
+      <w:r>
+        <w:t>Tableau de bord élève.</w:t>
+      </w:r>
+    </w:p>
+    <w:p>
+      <w:r>
+        <w:drawing>
+          <wp:inline xmlns:a="http://schemas.openxmlformats.org/drawingml/2006/main" xmlns:pic="http://schemas.openxmlformats.org/drawingml/2006/picture">
+            <wp:extent cx="5943600" cy="3714750"/>
+            <wp:docPr id="24" name="Picture 24"/>
+            <wp:cNvGraphicFramePr>
+              <a:graphicFrameLocks noChangeAspect="1"/>
+            </wp:cNvGraphicFramePr>
+            <a:graphic>
+              <a:graphicData uri="http://schemas.openxmlformats.org/drawingml/2006/picture">
+                <pic:pic>
+                  <pic:nvPicPr>
+                    <pic:cNvPr id="0" name="02_admin_accueil.png"/>
+                    <pic:cNvPicPr/>
+                  </pic:nvPicPr>
+                  <pic:blipFill>
+                    <a:blip r:embed="rId10"/>
+                    <a:stretch>
+                      <a:fillRect/>
+                    </a:stretch>
+                  </pic:blipFill>
+                  <pic:spPr>
+                    <a:xfrm>
+                      <a:off x="0" y="0"/>
+                      <a:ext cx="5943600" cy="3714750"/>
+                    </a:xfrm>
+                    <a:prstGeom prst="rect"/>
+                  </pic:spPr>
+                </pic:pic>
+              </a:graphicData>
+            </a:graphic>
+          </wp:inline>
+        </w:drawing>
+      </w:r>
+    </w:p>
+    <w:p>
+      <w:pPr>
+        <w:pStyle w:val="Heading1"/>
+      </w:pPr>
+      <w:r>
+        <w:t>25. Espace Élève - Notes</w:t>
+      </w:r>
+    </w:p>
+    <w:p>
+      <w:r>
+        <w:t>Consultation des notes et bulletins.</w:t>
+      </w:r>
+    </w:p>
+    <w:p>
+      <w:r>
+        <w:drawing>
+          <wp:inline xmlns:a="http://schemas.openxmlformats.org/drawingml/2006/main" xmlns:pic="http://schemas.openxmlformats.org/drawingml/2006/picture">
+            <wp:extent cx="5943600" cy="3714750"/>
+            <wp:docPr id="25" name="Picture 25"/>
+            <wp:cNvGraphicFramePr>
+              <a:graphicFrameLocks noChangeAspect="1"/>
+            </wp:cNvGraphicFramePr>
+            <a:graphic>
+              <a:graphicData uri="http://schemas.openxmlformats.org/drawingml/2006/picture">
+                <pic:pic>
+                  <pic:nvPicPr>
+                    <pic:cNvPr id="0" name="02_admin_accueil.png"/>
+                    <pic:cNvPicPr/>
+                  </pic:nvPicPr>
+                  <pic:blipFill>
+                    <a:blip r:embed="rId10"/>
+                    <a:stretch>
+                      <a:fillRect/>
+                    </a:stretch>
+                  </pic:blipFill>
+                  <pic:spPr>
+                    <a:xfrm>
+                      <a:off x="0" y="0"/>
+                      <a:ext cx="5943600" cy="3714750"/>
+                    </a:xfrm>
+                    <a:prstGeom prst="rect"/>
+                  </pic:spPr>
+                </pic:pic>
+              </a:graphicData>
+            </a:graphic>
+          </wp:inline>
+        </w:drawing>
+      </w:r>
+    </w:p>
+    <w:p>
+      <w:pPr>
+        <w:pStyle w:val="Heading1"/>
+      </w:pPr>
+      <w:r>
+        <w:t>26. Espace Élève - Emplois du temps</w:t>
+      </w:r>
+    </w:p>
+    <w:p>
+      <w:r>
+        <w:t>Emploi du temps personnel.</w:t>
+      </w:r>
+    </w:p>
+    <w:p>
+      <w:r>
+        <w:drawing>
+          <wp:inline xmlns:a="http://schemas.openxmlformats.org/drawingml/2006/main" xmlns:pic="http://schemas.openxmlformats.org/drawingml/2006/picture">
+            <wp:extent cx="5943600" cy="3714750"/>
+            <wp:docPr id="26" name="Picture 26"/>
+            <wp:cNvGraphicFramePr>
+              <a:graphicFrameLocks noChangeAspect="1"/>
+            </wp:cNvGraphicFramePr>
+            <a:graphic>
+              <a:graphicData uri="http://schemas.openxmlformats.org/drawingml/2006/picture">
+                <pic:pic>
+                  <pic:nvPicPr>
+                    <pic:cNvPr id="0" name="02_admin_accueil.png"/>
+                    <pic:cNvPicPr/>
+                  </pic:nvPicPr>
+                  <pic:blipFill>
+                    <a:blip r:embed="rId10"/>
+                    <a:stretch>
+                      <a:fillRect/>
+                    </a:stretch>
+                  </pic:blipFill>
+                  <pic:spPr>
+                    <a:xfrm>
+                      <a:off x="0" y="0"/>
+                      <a:ext cx="5943600" cy="3714750"/>
+                    </a:xfrm>
+                    <a:prstGeom prst="rect"/>
+                  </pic:spPr>
+                </pic:pic>
+              </a:graphicData>
+            </a:graphic>
+          </wp:inline>
+        </w:drawing>
+      </w:r>
+    </w:p>
+    <w:p>
+      <w:pPr>
+        <w:pStyle w:val="Heading1"/>
+      </w:pPr>
+      <w:r>
+        <w:t>27. Espace Élève - Présences</w:t>
+      </w:r>
+    </w:p>
+    <w:p>
+      <w:r>
+        <w:t>Suivi des présences et absences.</w:t>
+      </w:r>
+    </w:p>
+    <w:p>
+      <w:r>
+        <w:drawing>
+          <wp:inline xmlns:a="http://schemas.openxmlformats.org/drawingml/2006/main" xmlns:pic="http://schemas.openxmlformats.org/drawingml/2006/picture">
+            <wp:extent cx="5943600" cy="3714750"/>
+            <wp:docPr id="27" name="Picture 27"/>
+            <wp:cNvGraphicFramePr>
+              <a:graphicFrameLocks noChangeAspect="1"/>
+            </wp:cNvGraphicFramePr>
+            <a:graphic>
+              <a:graphicData uri="http://schemas.openxmlformats.org/drawingml/2006/picture">
+                <pic:pic>
+                  <pic:nvPicPr>
+                    <pic:cNvPr id="0" name="02_admin_accueil.png"/>
+                    <pic:cNvPicPr/>
+                  </pic:nvPicPr>
+                  <pic:blipFill>
+                    <a:blip r:embed="rId10"/>
+                    <a:stretch>
+                      <a:fillRect/>
+                    </a:stretch>
+                  </pic:blipFill>
+                  <pic:spPr>
+                    <a:xfrm>
+                      <a:off x="0" y="0"/>
+                      <a:ext cx="5943600" cy="3714750"/>
+                    </a:xfrm>
+                    <a:prstGeom prst="rect"/>
+                  </pic:spPr>
+                </pic:pic>
+              </a:graphicData>
+            </a:graphic>
+          </wp:inline>
+        </w:drawing>
+      </w:r>
+    </w:p>
+    <w:p>
+      <w:pPr>
+        <w:pStyle w:val="Heading1"/>
+      </w:pPr>
+      <w:r>
+        <w:t>28. Espace Élève - Discipline</w:t>
+      </w:r>
+    </w:p>
+    <w:p>
+      <w:r>
+        <w:t>Historique disciplinaire.</w:t>
+      </w:r>
+    </w:p>
+    <w:p>
+      <w:r>
+        <w:drawing>
+          <wp:inline xmlns:a="http://schemas.openxmlformats.org/drawingml/2006/main" xmlns:pic="http://schemas.openxmlformats.org/drawingml/2006/picture">
+            <wp:extent cx="5943600" cy="3714750"/>
+            <wp:docPr id="28" name="Picture 28"/>
+            <wp:cNvGraphicFramePr>
+              <a:graphicFrameLocks noChangeAspect="1"/>
+            </wp:cNvGraphicFramePr>
+            <a:graphic>
+              <a:graphicData uri="http://schemas.openxmlformats.org/drawingml/2006/picture">
+                <pic:pic>
+                  <pic:nvPicPr>
+                    <pic:cNvPr id="0" name="02_admin_accueil.png"/>
+                    <pic:cNvPicPr/>
+                  </pic:nvPicPr>
+                  <pic:blipFill>
+                    <a:blip r:embed="rId10"/>
+                    <a:stretch>
+                      <a:fillRect/>
+                    </a:stretch>
+                  </pic:blipFill>
+                  <pic:spPr>
+                    <a:xfrm>
+                      <a:off x="0" y="0"/>
+                      <a:ext cx="5943600" cy="3714750"/>
+                    </a:xfrm>
+                    <a:prstGeom prst="rect"/>
+                  </pic:spPr>
+                </pic:pic>
+              </a:graphicData>
+            </a:graphic>
+          </wp:inline>
+        </w:drawing>
+      </w:r>
+    </w:p>
+    <w:p>
+      <w:pPr>
+        <w:pStyle w:val="Heading1"/>
+      </w:pPr>
+      <w:r>
+        <w:t>29. Espace Élève - Communications</w:t>
+      </w:r>
+    </w:p>
+    <w:p>
+      <w:r>
+        <w:t>Messages reçus.</w:t>
+      </w:r>
+    </w:p>
+    <w:p>
+      <w:r>
+        <w:drawing>
+          <wp:inline xmlns:a="http://schemas.openxmlformats.org/drawingml/2006/main" xmlns:pic="http://schemas.openxmlformats.org/drawingml/2006/picture">
+            <wp:extent cx="5943600" cy="3714750"/>
+            <wp:docPr id="29" name="Picture 29"/>
+            <wp:cNvGraphicFramePr>
+              <a:graphicFrameLocks noChangeAspect="1"/>
+            </wp:cNvGraphicFramePr>
+            <a:graphic>
+              <a:graphicData uri="http://schemas.openxmlformats.org/drawingml/2006/picture">
+                <pic:pic>
+                  <pic:nvPicPr>
+                    <pic:cNvPr id="0" name="02_admin_accueil.png"/>
+                    <pic:cNvPicPr/>
+                  </pic:nvPicPr>
+                  <pic:blipFill>
+                    <a:blip r:embed="rId10"/>
+                    <a:stretch>
+                      <a:fillRect/>
+                    </a:stretch>
+                  </pic:blipFill>
+                  <pic:spPr>
+                    <a:xfrm>
+                      <a:off x="0" y="0"/>
+                      <a:ext cx="5943600" cy="3714750"/>
+                    </a:xfrm>
+                    <a:prstGeom prst="rect"/>
+                  </pic:spPr>
+                </pic:pic>
+              </a:graphicData>
+            </a:graphic>
+          </wp:inline>
+        </w:drawing>
+      </w:r>
+    </w:p>
+    <w:p>
+      <w:pPr>
+        <w:pStyle w:val="Heading1"/>
+      </w:pPr>
+      <w:r>
+        <w:t>30. Espace Élève - Documents</w:t>
+      </w:r>
+    </w:p>
+    <w:p>
+      <w:r>
+        <w:t>Documents partagés.</w:t>
+      </w:r>
+    </w:p>
+    <w:p>
+      <w:r>
+        <w:drawing>
+          <wp:inline xmlns:a="http://schemas.openxmlformats.org/drawingml/2006/main" xmlns:pic="http://schemas.openxmlformats.org/drawingml/2006/picture">
+            <wp:extent cx="5943600" cy="3714750"/>
+            <wp:docPr id="30" name="Picture 30"/>
+            <wp:cNvGraphicFramePr>
+              <a:graphicFrameLocks noChangeAspect="1"/>
+            </wp:cNvGraphicFramePr>
+            <a:graphic>
+              <a:graphicData uri="http://schemas.openxmlformats.org/drawingml/2006/picture">
+                <pic:pic>
+                  <pic:nvPicPr>
+                    <pic:cNvPr id="0" name="02_admin_accueil.png"/>
+                    <pic:cNvPicPr/>
+                  </pic:nvPicPr>
+                  <pic:blipFill>
+                    <a:blip r:embed="rId10"/>
+                    <a:stretch>
+                      <a:fillRect/>
+                    </a:stretch>
+                  </pic:blipFill>
+                  <pic:spPr>
+                    <a:xfrm>
+                      <a:off x="0" y="0"/>
+                      <a:ext cx="5943600" cy="3714750"/>
+                    </a:xfrm>
+                    <a:prstGeom prst="rect"/>
+                  </pic:spPr>
+                </pic:pic>
+              </a:graphicData>
+            </a:graphic>
+          </wp:inline>
+        </w:drawing>
+      </w:r>
+    </w:p>
+    <w:p>
+      <w:pPr>
+        <w:pStyle w:val="Heading1"/>
+      </w:pPr>
+      <w:r>
+        <w:t>31. Espace Élève - Finance</w:t>
+      </w:r>
+    </w:p>
+    <w:p>
+      <w:r>
+        <w:t>Frais et paiements.</w:t>
+      </w:r>
+    </w:p>
+    <w:p>
+      <w:r>
+        <w:drawing>
+          <wp:inline xmlns:a="http://schemas.openxmlformats.org/drawingml/2006/main" xmlns:pic="http://schemas.openxmlformats.org/drawingml/2006/picture">
+            <wp:extent cx="5943600" cy="3714750"/>
+            <wp:docPr id="31" name="Picture 31"/>
+            <wp:cNvGraphicFramePr>
+              <a:graphicFrameLocks noChangeAspect="1"/>
+            </wp:cNvGraphicFramePr>
+            <a:graphic>
+              <a:graphicData uri="http://schemas.openxmlformats.org/drawingml/2006/picture">
+                <pic:pic>
+                  <pic:nvPicPr>
+                    <pic:cNvPr id="0" name="02_admin_accueil.png"/>
+                    <pic:cNvPicPr/>
+                  </pic:nvPicPr>
+                  <pic:blipFill>
+                    <a:blip r:embed="rId10"/>
+                    <a:stretch>
+                      <a:fillRect/>
+                    </a:stretch>
+                  </pic:blipFill>
+                  <pic:spPr>
+                    <a:xfrm>
+                      <a:off x="0" y="0"/>
+                      <a:ext cx="5943600" cy="3714750"/>
+                    </a:xfrm>
+                    <a:prstGeom prst="rect"/>
+                  </pic:spPr>
+                </pic:pic>
+              </a:graphicData>
+            </a:graphic>
+          </wp:inline>
+        </w:drawing>
+      </w:r>
+    </w:p>
+    <w:p>
+      <w:pPr>
+        <w:pStyle w:val="Heading1"/>
+      </w:pPr>
+      <w:r>
+        <w:t>32. Espace Élève - Clubs</w:t>
+      </w:r>
+    </w:p>
+    <w:p>
+      <w:r>
+        <w:t>Inscription aux clubs.</w:t>
+      </w:r>
+    </w:p>
+    <w:p>
+      <w:r>
+        <w:drawing>
+          <wp:inline xmlns:a="http://schemas.openxmlformats.org/drawingml/2006/main" xmlns:pic="http://schemas.openxmlformats.org/drawingml/2006/picture">
+            <wp:extent cx="5943600" cy="3714750"/>
+            <wp:docPr id="32" name="Picture 32"/>
+            <wp:cNvGraphicFramePr>
+              <a:graphicFrameLocks noChangeAspect="1"/>
+            </wp:cNvGraphicFramePr>
+            <a:graphic>
+              <a:graphicData uri="http://schemas.openxmlformats.org/drawingml/2006/picture">
+                <pic:pic>
+                  <pic:nvPicPr>
+                    <pic:cNvPr id="0" name="02_admin_accueil.png"/>
+                    <pic:cNvPicPr/>
+                  </pic:nvPicPr>
+                  <pic:blipFill>
+                    <a:blip r:embed="rId10"/>
+                    <a:stretch>
+                      <a:fillRect/>
+                    </a:stretch>
+                  </pic:blipFill>
+                  <pic:spPr>
+                    <a:xfrm>
+                      <a:off x="0" y="0"/>
+                      <a:ext cx="5943600" cy="3714750"/>
+                    </a:xfrm>
+                    <a:prstGeom prst="rect"/>
+                  </pic:spPr>
+                </pic:pic>
+              </a:graphicData>
+            </a:graphic>
+          </wp:inline>
+        </w:drawing>
+      </w:r>
+    </w:p>
+    <w:p>
+      <w:pPr>
+        <w:pStyle w:val="Heading1"/>
+      </w:pPr>
+      <w:r>
+        <w:t>33. Espace Professeur - Accueil</w:t>
+      </w:r>
+    </w:p>
+    <w:p>
+      <w:r>
+        <w:t>Tableau de bord professeur.</w:t>
+      </w:r>
+    </w:p>
+    <w:p>
+      <w:r>
+        <w:drawing>
+          <wp:inline xmlns:a="http://schemas.openxmlformats.org/drawingml/2006/main" xmlns:pic="http://schemas.openxmlformats.org/drawingml/2006/picture">
+            <wp:extent cx="5943600" cy="3714750"/>
+            <wp:docPr id="33" name="Picture 33"/>
+            <wp:cNvGraphicFramePr>
+              <a:graphicFrameLocks noChangeAspect="1"/>
+            </wp:cNvGraphicFramePr>
+            <a:graphic>
+              <a:graphicData uri="http://schemas.openxmlformats.org/drawingml/2006/picture">
+                <pic:pic>
+                  <pic:nvPicPr>
+                    <pic:cNvPr id="0" name="02_admin_accueil.png"/>
+                    <pic:cNvPicPr/>
+                  </pic:nvPicPr>
+                  <pic:blipFill>
+                    <a:blip r:embed="rId10"/>
+                    <a:stretch>
+                      <a:fillRect/>
+                    </a:stretch>
+                  </pic:blipFill>
+                  <pic:spPr>
+                    <a:xfrm>
+                      <a:off x="0" y="0"/>
+                      <a:ext cx="5943600" cy="3714750"/>
+                    </a:xfrm>
+                    <a:prstGeom prst="rect"/>
+                  </pic:spPr>
+                </pic:pic>
+              </a:graphicData>
+            </a:graphic>
+          </wp:inline>
+        </w:drawing>
+      </w:r>
+    </w:p>
+    <w:p>
+      <w:pPr>
+        <w:pStyle w:val="Heading1"/>
+      </w:pPr>
+      <w:r>
+        <w:t>34. Espace Professeur - Saisie des notes</w:t>
+      </w:r>
+    </w:p>
+    <w:p>
+      <w:r>
+        <w:t>Saisie et modification des notes.</w:t>
+      </w:r>
+    </w:p>
+    <w:p>
+      <w:r>
+        <w:drawing>
+          <wp:inline xmlns:a="http://schemas.openxmlformats.org/drawingml/2006/main" xmlns:pic="http://schemas.openxmlformats.org/drawingml/2006/picture">
+            <wp:extent cx="5943600" cy="3714750"/>
+            <wp:docPr id="34" name="Picture 34"/>
+            <wp:cNvGraphicFramePr>
+              <a:graphicFrameLocks noChangeAspect="1"/>
+            </wp:cNvGraphicFramePr>
+            <a:graphic>
+              <a:graphicData uri="http://schemas.openxmlformats.org/drawingml/2006/picture">
+                <pic:pic>
+                  <pic:nvPicPr>
+                    <pic:cNvPr id="0" name="02_admin_accueil.png"/>
+                    <pic:cNvPicPr/>
+                  </pic:nvPicPr>
+                  <pic:blipFill>
+                    <a:blip r:embed="rId10"/>
+                    <a:stretch>
+                      <a:fillRect/>
+                    </a:stretch>
+                  </pic:blipFill>
+                  <pic:spPr>
+                    <a:xfrm>
+                      <a:off x="0" y="0"/>
+                      <a:ext cx="5943600" cy="3714750"/>
+                    </a:xfrm>
+                    <a:prstGeom prst="rect"/>
+                  </pic:spPr>
+                </pic:pic>
+              </a:graphicData>
+            </a:graphic>
+          </wp:inline>
+        </w:drawing>
+      </w:r>
+    </w:p>
+    <w:p>
+      <w:pPr>
+        <w:pStyle w:val="Heading1"/>
+      </w:pPr>
+      <w:r>
+        <w:t>35. Espace Professeur - Appel</w:t>
+      </w:r>
+    </w:p>
+    <w:p>
+      <w:r>
+        <w:t>Prise des présences.</w:t>
+      </w:r>
+    </w:p>
+    <w:p>
+      <w:r>
+        <w:drawing>
+          <wp:inline xmlns:a="http://schemas.openxmlformats.org/drawingml/2006/main" xmlns:pic="http://schemas.openxmlformats.org/drawingml/2006/picture">
+            <wp:extent cx="5943600" cy="3714750"/>
+            <wp:docPr id="35" name="Picture 35"/>
+            <wp:cNvGraphicFramePr>
+              <a:graphicFrameLocks noChangeAspect="1"/>
+            </wp:cNvGraphicFramePr>
+            <a:graphic>
+              <a:graphicData uri="http://schemas.openxmlformats.org/drawingml/2006/picture">
+                <pic:pic>
+                  <pic:nvPicPr>
+                    <pic:cNvPr id="0" name="02_admin_accueil.png"/>
+                    <pic:cNvPicPr/>
+                  </pic:nvPicPr>
+                  <pic:blipFill>
+                    <a:blip r:embed="rId10"/>
+                    <a:stretch>
+                      <a:fillRect/>
+                    </a:stretch>
+                  </pic:blipFill>
+                  <pic:spPr>
+                    <a:xfrm>
+                      <a:off x="0" y="0"/>
+                      <a:ext cx="5943600" cy="3714750"/>
+                    </a:xfrm>
+                    <a:prstGeom prst="rect"/>
+                  </pic:spPr>
+                </pic:pic>
+              </a:graphicData>
+            </a:graphic>
+          </wp:inline>
+        </w:drawing>
+      </w:r>
+    </w:p>
+    <w:p>
+      <w:pPr>
+        <w:pStyle w:val="Heading1"/>
+      </w:pPr>
+      <w:r>
+        <w:t>36. Espace Professeur - Emplois du temps</w:t>
+      </w:r>
+    </w:p>
+    <w:p>
+      <w:r>
+        <w:t>Horaires du professeur.</w:t>
+      </w:r>
+    </w:p>
+    <w:p>
+      <w:r>
+        <w:drawing>
+          <wp:inline xmlns:a="http://schemas.openxmlformats.org/drawingml/2006/main" xmlns:pic="http://schemas.openxmlformats.org/drawingml/2006/picture">
+            <wp:extent cx="5943600" cy="3714750"/>
+            <wp:docPr id="36" name="Picture 36"/>
+            <wp:cNvGraphicFramePr>
+              <a:graphicFrameLocks noChangeAspect="1"/>
+            </wp:cNvGraphicFramePr>
+            <a:graphic>
+              <a:graphicData uri="http://schemas.openxmlformats.org/drawingml/2006/picture">
+                <pic:pic>
+                  <pic:nvPicPr>
+                    <pic:cNvPr id="0" name="02_admin_accueil.png"/>
+                    <pic:cNvPicPr/>
+                  </pic:nvPicPr>
+                  <pic:blipFill>
+                    <a:blip r:embed="rId10"/>
+                    <a:stretch>
+                      <a:fillRect/>
+                    </a:stretch>
+                  </pic:blipFill>
+                  <pic:spPr>
+                    <a:xfrm>
+                      <a:off x="0" y="0"/>
+                      <a:ext cx="5943600" cy="3714750"/>
+                    </a:xfrm>
+                    <a:prstGeom prst="rect"/>
+                  </pic:spPr>
+                </pic:pic>
+              </a:graphicData>
+            </a:graphic>
+          </wp:inline>
+        </w:drawing>
+      </w:r>
+    </w:p>
+    <w:p>
+      <w:pPr>
+        <w:pStyle w:val="Heading1"/>
+      </w:pPr>
+      <w:r>
+        <w:t>37. Espace Professeur - Communications</w:t>
+      </w:r>
+    </w:p>
+    <w:p>
+      <w:r>
+        <w:t>Communications.</w:t>
+      </w:r>
+    </w:p>
+    <w:p>
+      <w:r>
+        <w:drawing>
+          <wp:inline xmlns:a="http://schemas.openxmlformats.org/drawingml/2006/main" xmlns:pic="http://schemas.openxmlformats.org/drawingml/2006/picture">
+            <wp:extent cx="5943600" cy="3714750"/>
+            <wp:docPr id="37" name="Picture 37"/>
+            <wp:cNvGraphicFramePr>
+              <a:graphicFrameLocks noChangeAspect="1"/>
+            </wp:cNvGraphicFramePr>
+            <a:graphic>
+              <a:graphicData uri="http://schemas.openxmlformats.org/drawingml/2006/picture">
+                <pic:pic>
+                  <pic:nvPicPr>
+                    <pic:cNvPr id="0" name="02_admin_accueil.png"/>
+                    <pic:cNvPicPr/>
+                  </pic:nvPicPr>
+                  <pic:blipFill>
+                    <a:blip r:embed="rId10"/>
+                    <a:stretch>
+                      <a:fillRect/>
+                    </a:stretch>
+                  </pic:blipFill>
+                  <pic:spPr>
+                    <a:xfrm>
+                      <a:off x="0" y="0"/>
+                      <a:ext cx="5943600" cy="3714750"/>
+                    </a:xfrm>
+                    <a:prstGeom prst="rect"/>
+                  </pic:spPr>
+                </pic:pic>
+              </a:graphicData>
+            </a:graphic>
+          </wp:inline>
+        </w:drawing>
+      </w:r>
+    </w:p>
+    <w:p>
+      <w:pPr>
+        <w:pStyle w:val="Heading1"/>
+      </w:pPr>
+      <w:r>
+        <w:t>38. Espace Professeur - Documents</w:t>
+      </w:r>
+    </w:p>
+    <w:p>
+      <w:r>
+        <w:t>Documents partagés.</w:t>
+      </w:r>
+    </w:p>
+    <w:p>
+      <w:r>
+        <w:drawing>
+          <wp:inline xmlns:a="http://schemas.openxmlformats.org/drawingml/2006/main" xmlns:pic="http://schemas.openxmlformats.org/drawingml/2006/picture">
+            <wp:extent cx="5943600" cy="3714750"/>
+            <wp:docPr id="38" name="Picture 38"/>
+            <wp:cNvGraphicFramePr>
+              <a:graphicFrameLocks noChangeAspect="1"/>
+            </wp:cNvGraphicFramePr>
+            <a:graphic>
+              <a:graphicData uri="http://schemas.openxmlformats.org/drawingml/2006/picture">
+                <pic:pic>
+                  <pic:nvPicPr>
+                    <pic:cNvPr id="0" name="02_admin_accueil.png"/>
+                    <pic:cNvPicPr/>
+                  </pic:nvPicPr>
+                  <pic:blipFill>
+                    <a:blip r:embed="rId10"/>
+                    <a:stretch>
+                      <a:fillRect/>
+                    </a:stretch>
+                  </pic:blipFill>
+                  <pic:spPr>
+                    <a:xfrm>
+                      <a:off x="0" y="0"/>
+                      <a:ext cx="5943600" cy="3714750"/>
                     </a:xfrm>
                     <a:prstGeom prst="rect"/>
                   </pic:spPr>

</xml_diff>